<commit_message>
Se agrego Jose Gonzalez
</commit_message>
<xml_diff>
--- a/ArchivoPrueba.docx
+++ b/ArchivoPrueba.docx
@@ -636,13 +636,6 @@
         </w:tabs>
         <w:spacing w:line="276" w:lineRule="auto"/>
         <w:rPr>
-          <w:noProof/>
-          <w:sz w:val="24"/>
-          <w:szCs w:val="24"/>
-        </w:rPr>
-      </w:pPr>
-      <w:r>
-        <w:rPr>
           <w:b/>
           <w:bCs/>
           <w:noProof/>
@@ -650,7 +643,204 @@
           <w:sz w:val="24"/>
           <w:szCs w:val="24"/>
         </w:rPr>
+      </w:pPr>
+      <w:r>
+        <w:rPr>
+          <w:b/>
+          <w:bCs/>
+          <w:noProof/>
+          <w:color w:val="4472C4" w:themeColor="accent1"/>
+          <w:sz w:val="24"/>
+          <w:szCs w:val="24"/>
+        </w:rPr>
         <w:t>Prueba 1</w:t>
+      </w:r>
+    </w:p>
+    <w:p>
+      <w:pPr>
+        <w:pStyle w:val="Sinespaciado"/>
+        <w:tabs>
+          <w:tab w:val="left" w:pos="5670"/>
+        </w:tabs>
+        <w:spacing w:line="276" w:lineRule="auto"/>
+        <w:rPr>
+          <w:b/>
+          <w:bCs/>
+          <w:noProof/>
+          <w:color w:val="4472C4" w:themeColor="accent1"/>
+          <w:sz w:val="24"/>
+          <w:szCs w:val="24"/>
+        </w:rPr>
+      </w:pPr>
+      <w:r>
+        <w:rPr>
+          <w:b/>
+          <w:bCs/>
+          <w:noProof/>
+          <w:color w:val="4472C4" w:themeColor="accent1"/>
+          <w:sz w:val="24"/>
+          <w:szCs w:val="24"/>
+        </w:rPr>
+        <w:t>Programador1</w:t>
+      </w:r>
+    </w:p>
+    <w:p>
+      <w:pPr>
+        <w:pStyle w:val="Sinespaciado"/>
+        <w:tabs>
+          <w:tab w:val="left" w:pos="5670"/>
+        </w:tabs>
+        <w:spacing w:line="276" w:lineRule="auto"/>
+        <w:rPr>
+          <w:b/>
+          <w:bCs/>
+          <w:noProof/>
+          <w:color w:val="4472C4" w:themeColor="accent1"/>
+          <w:sz w:val="24"/>
+          <w:szCs w:val="24"/>
+        </w:rPr>
+      </w:pPr>
+      <w:r>
+        <w:rPr>
+          <w:b/>
+          <w:bCs/>
+          <w:noProof/>
+          <w:color w:val="4472C4" w:themeColor="accent1"/>
+          <w:sz w:val="24"/>
+          <w:szCs w:val="24"/>
+        </w:rPr>
+        <w:t>Programador2</w:t>
+      </w:r>
+      <w:r>
+        <w:rPr>
+          <w:b/>
+          <w:bCs/>
+          <w:noProof/>
+          <w:color w:val="4472C4" w:themeColor="accent1"/>
+          <w:sz w:val="24"/>
+          <w:szCs w:val="24"/>
+        </w:rPr>
+        <w:t xml:space="preserve"> Es malo</w:t>
+      </w:r>
+    </w:p>
+    <w:p>
+      <w:pPr>
+        <w:pStyle w:val="Sinespaciado"/>
+        <w:tabs>
+          <w:tab w:val="left" w:pos="5670"/>
+        </w:tabs>
+        <w:spacing w:line="276" w:lineRule="auto"/>
+        <w:rPr>
+          <w:b/>
+          <w:bCs/>
+          <w:noProof/>
+          <w:color w:val="4472C4" w:themeColor="accent1"/>
+          <w:sz w:val="24"/>
+          <w:szCs w:val="24"/>
+        </w:rPr>
+      </w:pPr>
+      <w:r>
+        <w:rPr>
+          <w:b/>
+          <w:bCs/>
+          <w:noProof/>
+          <w:color w:val="4472C4" w:themeColor="accent1"/>
+          <w:sz w:val="24"/>
+          <w:szCs w:val="24"/>
+        </w:rPr>
+        <w:t>Programador3</w:t>
+      </w:r>
+      <w:r>
+        <w:rPr>
+          <w:b/>
+          <w:bCs/>
+          <w:noProof/>
+          <w:color w:val="4472C4" w:themeColor="accent1"/>
+          <w:sz w:val="24"/>
+          <w:szCs w:val="24"/>
+        </w:rPr>
+        <w:t xml:space="preserve"> Es bueno</w:t>
+      </w:r>
+    </w:p>
+    <w:p>
+      <w:pPr>
+        <w:pStyle w:val="Sinespaciado"/>
+        <w:tabs>
+          <w:tab w:val="left" w:pos="5670"/>
+        </w:tabs>
+        <w:spacing w:line="276" w:lineRule="auto"/>
+        <w:rPr>
+          <w:b/>
+          <w:bCs/>
+          <w:noProof/>
+          <w:color w:val="4472C4" w:themeColor="accent1"/>
+          <w:sz w:val="24"/>
+          <w:szCs w:val="24"/>
+        </w:rPr>
+      </w:pPr>
+      <w:r>
+        <w:rPr>
+          <w:b/>
+          <w:bCs/>
+          <w:noProof/>
+          <w:color w:val="4472C4" w:themeColor="accent1"/>
+          <w:sz w:val="24"/>
+          <w:szCs w:val="24"/>
+        </w:rPr>
+        <w:t>Programador4</w:t>
+      </w:r>
+    </w:p>
+    <w:p>
+      <w:pPr>
+        <w:pStyle w:val="Sinespaciado"/>
+        <w:tabs>
+          <w:tab w:val="left" w:pos="5670"/>
+        </w:tabs>
+        <w:spacing w:line="276" w:lineRule="auto"/>
+        <w:rPr>
+          <w:b/>
+          <w:bCs/>
+          <w:noProof/>
+          <w:color w:val="4472C4" w:themeColor="accent1"/>
+          <w:sz w:val="24"/>
+          <w:szCs w:val="24"/>
+        </w:rPr>
+      </w:pPr>
+      <w:r>
+        <w:rPr>
+          <w:b/>
+          <w:bCs/>
+          <w:noProof/>
+          <w:color w:val="4472C4" w:themeColor="accent1"/>
+          <w:sz w:val="24"/>
+          <w:szCs w:val="24"/>
+        </w:rPr>
+        <w:t>Programador5</w:t>
+      </w:r>
+    </w:p>
+    <w:p>
+      <w:pPr>
+        <w:pStyle w:val="Sinespaciado"/>
+        <w:tabs>
+          <w:tab w:val="left" w:pos="5670"/>
+        </w:tabs>
+        <w:spacing w:line="276" w:lineRule="auto"/>
+        <w:rPr>
+          <w:noProof/>
+          <w:sz w:val="24"/>
+          <w:szCs w:val="24"/>
+        </w:rPr>
+      </w:pPr>
+      <w:r>
+        <w:rPr>
+          <w:b/>
+          <w:bCs/>
+          <w:noProof/>
+          <w:color w:val="4472C4" w:themeColor="accent1"/>
+          <w:sz w:val="24"/>
+          <w:szCs w:val="24"/>
+        </w:rPr>
+        <w:t>Jose Gonzalez</w:t>
       </w:r>
     </w:p>
     <w:sectPr>

</xml_diff>

<commit_message>
Se agrego Rodrigo Gonzalez
</commit_message>
<xml_diff>
--- a/ArchivoPrueba.docx
+++ b/ArchivoPrueba.docx
@@ -636,13 +636,6 @@
         </w:tabs>
         <w:spacing w:line="276" w:lineRule="auto"/>
         <w:rPr>
-          <w:noProof/>
-          <w:sz w:val="24"/>
-          <w:szCs w:val="24"/>
-        </w:rPr>
-      </w:pPr>
-      <w:r>
-        <w:rPr>
           <w:b/>
           <w:bCs/>
           <w:noProof/>
@@ -650,7 +643,232 @@
           <w:sz w:val="24"/>
           <w:szCs w:val="24"/>
         </w:rPr>
+      </w:pPr>
+      <w:r>
+        <w:rPr>
+          <w:b/>
+          <w:bCs/>
+          <w:noProof/>
+          <w:color w:val="4472C4" w:themeColor="accent1"/>
+          <w:sz w:val="24"/>
+          <w:szCs w:val="24"/>
+        </w:rPr>
         <w:t>Prueba 1</w:t>
+      </w:r>
+    </w:p>
+    <w:p>
+      <w:pPr>
+        <w:pStyle w:val="Sinespaciado"/>
+        <w:tabs>
+          <w:tab w:val="left" w:pos="5670"/>
+        </w:tabs>
+        <w:spacing w:line="276" w:lineRule="auto"/>
+        <w:rPr>
+          <w:b/>
+          <w:bCs/>
+          <w:noProof/>
+          <w:color w:val="4472C4" w:themeColor="accent1"/>
+          <w:sz w:val="24"/>
+          <w:szCs w:val="24"/>
+        </w:rPr>
+      </w:pPr>
+      <w:r>
+        <w:rPr>
+          <w:b/>
+          <w:bCs/>
+          <w:noProof/>
+          <w:color w:val="4472C4" w:themeColor="accent1"/>
+          <w:sz w:val="24"/>
+          <w:szCs w:val="24"/>
+        </w:rPr>
+        <w:t>Programador1</w:t>
+      </w:r>
+    </w:p>
+    <w:p>
+      <w:pPr>
+        <w:pStyle w:val="Sinespaciado"/>
+        <w:tabs>
+          <w:tab w:val="left" w:pos="5670"/>
+        </w:tabs>
+        <w:spacing w:line="276" w:lineRule="auto"/>
+        <w:rPr>
+          <w:b/>
+          <w:bCs/>
+          <w:noProof/>
+          <w:color w:val="4472C4" w:themeColor="accent1"/>
+          <w:sz w:val="24"/>
+          <w:szCs w:val="24"/>
+        </w:rPr>
+      </w:pPr>
+      <w:r>
+        <w:rPr>
+          <w:b/>
+          <w:bCs/>
+          <w:noProof/>
+          <w:color w:val="4472C4" w:themeColor="accent1"/>
+          <w:sz w:val="24"/>
+          <w:szCs w:val="24"/>
+        </w:rPr>
+        <w:t>Programador2</w:t>
+      </w:r>
+      <w:r>
+        <w:rPr>
+          <w:b/>
+          <w:bCs/>
+          <w:noProof/>
+          <w:color w:val="4472C4" w:themeColor="accent1"/>
+          <w:sz w:val="24"/>
+          <w:szCs w:val="24"/>
+        </w:rPr>
+        <w:t xml:space="preserve"> Es malo</w:t>
+      </w:r>
+    </w:p>
+    <w:p>
+      <w:pPr>
+        <w:pStyle w:val="Sinespaciado"/>
+        <w:tabs>
+          <w:tab w:val="left" w:pos="5670"/>
+        </w:tabs>
+        <w:spacing w:line="276" w:lineRule="auto"/>
+        <w:rPr>
+          <w:b/>
+          <w:bCs/>
+          <w:noProof/>
+          <w:color w:val="4472C4" w:themeColor="accent1"/>
+          <w:sz w:val="24"/>
+          <w:szCs w:val="24"/>
+        </w:rPr>
+      </w:pPr>
+      <w:r>
+        <w:rPr>
+          <w:b/>
+          <w:bCs/>
+          <w:noProof/>
+          <w:color w:val="4472C4" w:themeColor="accent1"/>
+          <w:sz w:val="24"/>
+          <w:szCs w:val="24"/>
+        </w:rPr>
+        <w:t>Programador3</w:t>
+      </w:r>
+      <w:r>
+        <w:rPr>
+          <w:b/>
+          <w:bCs/>
+          <w:noProof/>
+          <w:color w:val="4472C4" w:themeColor="accent1"/>
+          <w:sz w:val="24"/>
+          <w:szCs w:val="24"/>
+        </w:rPr>
+        <w:t xml:space="preserve"> Es bueno</w:t>
+      </w:r>
+    </w:p>
+    <w:p>
+      <w:pPr>
+        <w:pStyle w:val="Sinespaciado"/>
+        <w:tabs>
+          <w:tab w:val="left" w:pos="5670"/>
+        </w:tabs>
+        <w:spacing w:line="276" w:lineRule="auto"/>
+        <w:rPr>
+          <w:b/>
+          <w:bCs/>
+          <w:noProof/>
+          <w:color w:val="4472C4" w:themeColor="accent1"/>
+          <w:sz w:val="24"/>
+          <w:szCs w:val="24"/>
+        </w:rPr>
+      </w:pPr>
+      <w:r>
+        <w:rPr>
+          <w:b/>
+          <w:bCs/>
+          <w:noProof/>
+          <w:color w:val="4472C4" w:themeColor="accent1"/>
+          <w:sz w:val="24"/>
+          <w:szCs w:val="24"/>
+        </w:rPr>
+        <w:t>Programador4</w:t>
+      </w:r>
+    </w:p>
+    <w:p>
+      <w:pPr>
+        <w:pStyle w:val="Sinespaciado"/>
+        <w:tabs>
+          <w:tab w:val="left" w:pos="5670"/>
+        </w:tabs>
+        <w:spacing w:line="276" w:lineRule="auto"/>
+        <w:rPr>
+          <w:b/>
+          <w:bCs/>
+          <w:noProof/>
+          <w:color w:val="4472C4" w:themeColor="accent1"/>
+          <w:sz w:val="24"/>
+          <w:szCs w:val="24"/>
+        </w:rPr>
+      </w:pPr>
+      <w:r>
+        <w:rPr>
+          <w:b/>
+          <w:bCs/>
+          <w:noProof/>
+          <w:color w:val="4472C4" w:themeColor="accent1"/>
+          <w:sz w:val="24"/>
+          <w:szCs w:val="24"/>
+        </w:rPr>
+        <w:t>Programador5</w:t>
+      </w:r>
+    </w:p>
+    <w:p>
+      <w:pPr>
+        <w:pStyle w:val="Sinespaciado"/>
+        <w:tabs>
+          <w:tab w:val="left" w:pos="5670"/>
+        </w:tabs>
+        <w:spacing w:line="276" w:lineRule="auto"/>
+        <w:rPr>
+          <w:b/>
+          <w:bCs/>
+          <w:noProof/>
+          <w:color w:val="4472C4" w:themeColor="accent1"/>
+          <w:sz w:val="24"/>
+          <w:szCs w:val="24"/>
+        </w:rPr>
+      </w:pPr>
+      <w:r>
+        <w:rPr>
+          <w:b/>
+          <w:bCs/>
+          <w:noProof/>
+          <w:color w:val="4472C4" w:themeColor="accent1"/>
+          <w:sz w:val="24"/>
+          <w:szCs w:val="24"/>
+        </w:rPr>
+        <w:t>Jose Gonzalez</w:t>
+      </w:r>
+    </w:p>
+    <w:p>
+      <w:pPr>
+        <w:pStyle w:val="Sinespaciado"/>
+        <w:tabs>
+          <w:tab w:val="left" w:pos="5670"/>
+        </w:tabs>
+        <w:spacing w:line="276" w:lineRule="auto"/>
+        <w:rPr>
+          <w:noProof/>
+          <w:sz w:val="24"/>
+          <w:szCs w:val="24"/>
+        </w:rPr>
+      </w:pPr>
+      <w:r>
+        <w:rPr>
+          <w:b/>
+          <w:bCs/>
+          <w:noProof/>
+          <w:color w:val="4472C4" w:themeColor="accent1"/>
+          <w:sz w:val="24"/>
+          <w:szCs w:val="24"/>
+        </w:rPr>
+        <w:t>Rodrigo Vasquez</w:t>
       </w:r>
     </w:p>
     <w:sectPr>

</xml_diff>